<commit_message>
Agregar nombres de alumnos al archivo
</commit_message>
<xml_diff>
--- a/Tarea de gestion de errores y excepciones RESUELTA.docx
+++ b/Tarea de gestion de errores y excepciones RESUELTA.docx
@@ -14,6 +14,45 @@
           <w:lang w:val="es-ES"/>
         </w:rPr>
         <w:t>Tarea de gestion de errores y excepciones</w:t>
+      </w:r>
+    </w:p>
+    <w:p>
+      <w:pPr>
+        <w:rPr>
+          <w:rStyle w:val="Strong"/>
+          <w:sz w:val="28"/>
+          <w:szCs w:val="28"/>
+          <w:lang w:val="es-ES"/>
+        </w:rPr>
+      </w:pPr>
+      <w:r>
+        <w:rPr>
+          <w:rStyle w:val="Strong"/>
+          <w:sz w:val="28"/>
+          <w:szCs w:val="28"/>
+          <w:lang w:val="es-ES"/>
+        </w:rPr>
+        <w:t xml:space="preserve">Brayan Romero, </w:t>
+      </w:r>
+      <w:proofErr w:type="spellStart"/>
+      <w:r>
+        <w:rPr>
+          <w:rStyle w:val="Strong"/>
+          <w:sz w:val="28"/>
+          <w:szCs w:val="28"/>
+          <w:lang w:val="es-ES"/>
+        </w:rPr>
+        <w:t>Ivan</w:t>
+      </w:r>
+      <w:proofErr w:type="spellEnd"/>
+      <w:r>
+        <w:rPr>
+          <w:rStyle w:val="Strong"/>
+          <w:sz w:val="28"/>
+          <w:szCs w:val="28"/>
+          <w:lang w:val="es-ES"/>
+        </w:rPr>
+        <w:t xml:space="preserve"> Vivanco, Aritz Navarro</w:t>
       </w:r>
     </w:p>
     <w:p>
@@ -2880,6 +2919,7 @@
           <w:color w:val="000000" w:themeColor="text1"/>
           <w:lang w:val="es-ES"/>
         </w:rPr>
+        <w:lastRenderedPageBreak/>
         <w:t>2.- ¿Qué te llama la atención o parece extraño en este código?</w:t>
       </w:r>
     </w:p>
@@ -2894,7 +2934,6 @@
         <w:rPr>
           <w:lang w:val="es-ES"/>
         </w:rPr>
-        <w:lastRenderedPageBreak/>
         <w:t>Respuesta</w:t>
       </w:r>
     </w:p>
@@ -3356,6 +3395,7 @@
         <w:rPr>
           <w:lang w:val="es-ES"/>
         </w:rPr>
+        <w:lastRenderedPageBreak/>
         <w:t>Respuesta</w:t>
       </w:r>
     </w:p>
@@ -3399,14 +3439,7 @@
         <w:rPr>
           <w:lang w:val="es-ES"/>
         </w:rPr>
-        <w:t xml:space="preserve"> como si apuntara a un objeto: invocar un método sobre ella, acceder a un atributo, recorrerla, </w:t>
-      </w:r>
-      <w:r>
-        <w:rPr>
-          <w:lang w:val="es-ES"/>
-        </w:rPr>
-        <w:lastRenderedPageBreak/>
-        <w:t xml:space="preserve">etc. Es una excepción </w:t>
+        <w:t xml:space="preserve"> como si apuntara a un objeto: invocar un método sobre ella, acceder a un atributo, recorrerla, etc. Es una excepción </w:t>
       </w:r>
       <w:r>
         <w:rPr>
@@ -4356,6 +4389,7 @@
           <w:color w:val="000000" w:themeColor="text1"/>
           <w:lang w:val="es-ES"/>
         </w:rPr>
+        <w:lastRenderedPageBreak/>
         <w:t>Número 1: 10</w:t>
       </w:r>
       <w:r>
@@ -4408,7 +4442,6 @@
           <w:color w:val="000000" w:themeColor="text1"/>
           <w:lang w:val="es-ES"/>
         </w:rPr>
-        <w:lastRenderedPageBreak/>
         <w:t>Debe realizar:</w:t>
       </w:r>
     </w:p>
@@ -5141,6 +5174,7 @@
           <w:szCs w:val="18"/>
           <w:lang w:val="es-ES"/>
         </w:rPr>
+        <w:lastRenderedPageBreak/>
         <w:t>Número 2: 0</w:t>
       </w:r>
     </w:p>
@@ -5308,7 +5342,6 @@
           <w:szCs w:val="18"/>
           <w:lang w:val="es-ES"/>
         </w:rPr>
-        <w:lastRenderedPageBreak/>
         <w:t>Número 2: 3</w:t>
       </w:r>
     </w:p>
@@ -6300,109 +6333,6 @@
                 <w:color w:val="000000" w:themeColor="text1"/>
                 <w:lang w:val="es-ES"/>
               </w:rPr>
-              <w:t xml:space="preserve"> </w:t>
-            </w:r>
-          </w:p>
-          <w:p>
-            <w:pPr>
-              <w:rPr>
-                <w:rFonts w:ascii="Aptos" w:eastAsia="Aptos" w:hAnsi="Aptos" w:cs="Aptos"/>
-                <w:color w:val="000000" w:themeColor="text1"/>
-                <w:lang w:val="es-ES"/>
-              </w:rPr>
-            </w:pPr>
-            <w:r>
-              <w:rPr>
-                <w:rFonts w:ascii="Aptos" w:eastAsia="Aptos" w:hAnsi="Aptos" w:cs="Aptos"/>
-                <w:color w:val="000000" w:themeColor="text1"/>
-                <w:lang w:val="es-ES"/>
-              </w:rPr>
-              <w:t xml:space="preserve">    // Simula un controlador (capa del controlador)</w:t>
-            </w:r>
-          </w:p>
-          <w:p>
-            <w:pPr>
-              <w:rPr>
-                <w:rFonts w:ascii="Aptos" w:eastAsia="Aptos" w:hAnsi="Aptos" w:cs="Aptos"/>
-                <w:color w:val="000000" w:themeColor="text1"/>
-                <w:lang w:val="es-ES"/>
-              </w:rPr>
-            </w:pPr>
-            <w:r>
-              <w:rPr>
-                <w:rFonts w:ascii="Aptos" w:eastAsia="Aptos" w:hAnsi="Aptos" w:cs="Aptos"/>
-                <w:color w:val="000000" w:themeColor="text1"/>
-                <w:lang w:val="es-ES"/>
-              </w:rPr>
-              <w:t xml:space="preserve">    public static void </w:t>
-            </w:r>
-            <w:proofErr w:type="gramStart"/>
-            <w:r>
-              <w:rPr>
-                <w:rFonts w:ascii="Aptos" w:eastAsia="Aptos" w:hAnsi="Aptos" w:cs="Aptos"/>
-                <w:color w:val="000000" w:themeColor="text1"/>
-                <w:lang w:val="es-ES"/>
-              </w:rPr>
-              <w:t>controlador(</w:t>
-            </w:r>
-            <w:proofErr w:type="gramEnd"/>
-            <w:r>
-              <w:rPr>
-                <w:rFonts w:ascii="Aptos" w:eastAsia="Aptos" w:hAnsi="Aptos" w:cs="Aptos"/>
-                <w:color w:val="000000" w:themeColor="text1"/>
-                <w:lang w:val="es-ES"/>
-              </w:rPr>
-              <w:t>) {</w:t>
-            </w:r>
-          </w:p>
-          <w:p>
-            <w:pPr>
-              <w:rPr>
-                <w:rFonts w:ascii="Aptos" w:eastAsia="Aptos" w:hAnsi="Aptos" w:cs="Aptos"/>
-                <w:color w:val="000000" w:themeColor="text1"/>
-                <w:lang w:val="es-ES"/>
-              </w:rPr>
-            </w:pPr>
-            <w:r>
-              <w:rPr>
-                <w:rFonts w:ascii="Aptos" w:eastAsia="Aptos" w:hAnsi="Aptos" w:cs="Aptos"/>
-                <w:color w:val="000000" w:themeColor="text1"/>
-                <w:lang w:val="es-ES"/>
-              </w:rPr>
-              <w:t xml:space="preserve"> </w:t>
-            </w:r>
-          </w:p>
-          <w:p>
-            <w:pPr>
-              <w:rPr>
-                <w:rFonts w:ascii="Aptos" w:eastAsia="Aptos" w:hAnsi="Aptos" w:cs="Aptos"/>
-                <w:color w:val="000000" w:themeColor="text1"/>
-                <w:lang w:val="es-ES"/>
-              </w:rPr>
-            </w:pPr>
-            <w:r>
-              <w:rPr>
-                <w:rFonts w:ascii="Aptos" w:eastAsia="Aptos" w:hAnsi="Aptos" w:cs="Aptos"/>
-                <w:color w:val="000000" w:themeColor="text1"/>
-                <w:lang w:val="es-ES"/>
-              </w:rPr>
-              <w:t xml:space="preserve">        System.out.println("Controlador: recibo la petición");</w:t>
-            </w:r>
-          </w:p>
-          <w:p>
-            <w:pPr>
-              <w:rPr>
-                <w:rFonts w:ascii="Aptos" w:eastAsia="Aptos" w:hAnsi="Aptos" w:cs="Aptos"/>
-                <w:color w:val="000000" w:themeColor="text1"/>
-                <w:lang w:val="es-ES"/>
-              </w:rPr>
-            </w:pPr>
-            <w:r>
-              <w:rPr>
-                <w:rFonts w:ascii="Aptos" w:eastAsia="Aptos" w:hAnsi="Aptos" w:cs="Aptos"/>
-                <w:color w:val="000000" w:themeColor="text1"/>
-                <w:lang w:val="es-ES"/>
-              </w:rPr>
               <w:lastRenderedPageBreak/>
               <w:t xml:space="preserve"> </w:t>
             </w:r>
@@ -6421,6 +6351,109 @@
                 <w:color w:val="000000" w:themeColor="text1"/>
                 <w:lang w:val="es-ES"/>
               </w:rPr>
+              <w:t xml:space="preserve">    // Simula un controlador (capa del controlador)</w:t>
+            </w:r>
+          </w:p>
+          <w:p>
+            <w:pPr>
+              <w:rPr>
+                <w:rFonts w:ascii="Aptos" w:eastAsia="Aptos" w:hAnsi="Aptos" w:cs="Aptos"/>
+                <w:color w:val="000000" w:themeColor="text1"/>
+                <w:lang w:val="es-ES"/>
+              </w:rPr>
+            </w:pPr>
+            <w:r>
+              <w:rPr>
+                <w:rFonts w:ascii="Aptos" w:eastAsia="Aptos" w:hAnsi="Aptos" w:cs="Aptos"/>
+                <w:color w:val="000000" w:themeColor="text1"/>
+                <w:lang w:val="es-ES"/>
+              </w:rPr>
+              <w:t xml:space="preserve">    public static void </w:t>
+            </w:r>
+            <w:proofErr w:type="gramStart"/>
+            <w:r>
+              <w:rPr>
+                <w:rFonts w:ascii="Aptos" w:eastAsia="Aptos" w:hAnsi="Aptos" w:cs="Aptos"/>
+                <w:color w:val="000000" w:themeColor="text1"/>
+                <w:lang w:val="es-ES"/>
+              </w:rPr>
+              <w:t>controlador(</w:t>
+            </w:r>
+            <w:proofErr w:type="gramEnd"/>
+            <w:r>
+              <w:rPr>
+                <w:rFonts w:ascii="Aptos" w:eastAsia="Aptos" w:hAnsi="Aptos" w:cs="Aptos"/>
+                <w:color w:val="000000" w:themeColor="text1"/>
+                <w:lang w:val="es-ES"/>
+              </w:rPr>
+              <w:t>) {</w:t>
+            </w:r>
+          </w:p>
+          <w:p>
+            <w:pPr>
+              <w:rPr>
+                <w:rFonts w:ascii="Aptos" w:eastAsia="Aptos" w:hAnsi="Aptos" w:cs="Aptos"/>
+                <w:color w:val="000000" w:themeColor="text1"/>
+                <w:lang w:val="es-ES"/>
+              </w:rPr>
+            </w:pPr>
+            <w:r>
+              <w:rPr>
+                <w:rFonts w:ascii="Aptos" w:eastAsia="Aptos" w:hAnsi="Aptos" w:cs="Aptos"/>
+                <w:color w:val="000000" w:themeColor="text1"/>
+                <w:lang w:val="es-ES"/>
+              </w:rPr>
+              <w:t xml:space="preserve"> </w:t>
+            </w:r>
+          </w:p>
+          <w:p>
+            <w:pPr>
+              <w:rPr>
+                <w:rFonts w:ascii="Aptos" w:eastAsia="Aptos" w:hAnsi="Aptos" w:cs="Aptos"/>
+                <w:color w:val="000000" w:themeColor="text1"/>
+                <w:lang w:val="es-ES"/>
+              </w:rPr>
+            </w:pPr>
+            <w:r>
+              <w:rPr>
+                <w:rFonts w:ascii="Aptos" w:eastAsia="Aptos" w:hAnsi="Aptos" w:cs="Aptos"/>
+                <w:color w:val="000000" w:themeColor="text1"/>
+                <w:lang w:val="es-ES"/>
+              </w:rPr>
+              <w:t xml:space="preserve">        System.out.println("Controlador: recibo la petición");</w:t>
+            </w:r>
+          </w:p>
+          <w:p>
+            <w:pPr>
+              <w:rPr>
+                <w:rFonts w:ascii="Aptos" w:eastAsia="Aptos" w:hAnsi="Aptos" w:cs="Aptos"/>
+                <w:color w:val="000000" w:themeColor="text1"/>
+                <w:lang w:val="es-ES"/>
+              </w:rPr>
+            </w:pPr>
+            <w:r>
+              <w:rPr>
+                <w:rFonts w:ascii="Aptos" w:eastAsia="Aptos" w:hAnsi="Aptos" w:cs="Aptos"/>
+                <w:color w:val="000000" w:themeColor="text1"/>
+                <w:lang w:val="es-ES"/>
+              </w:rPr>
+              <w:t xml:space="preserve"> </w:t>
+            </w:r>
+          </w:p>
+          <w:p>
+            <w:pPr>
+              <w:rPr>
+                <w:rFonts w:ascii="Aptos" w:eastAsia="Aptos" w:hAnsi="Aptos" w:cs="Aptos"/>
+                <w:color w:val="000000" w:themeColor="text1"/>
+                <w:lang w:val="es-ES"/>
+              </w:rPr>
+            </w:pPr>
+            <w:r>
+              <w:rPr>
+                <w:rFonts w:ascii="Aptos" w:eastAsia="Aptos" w:hAnsi="Aptos" w:cs="Aptos"/>
+                <w:color w:val="000000" w:themeColor="text1"/>
+                <w:lang w:val="es-ES"/>
+              </w:rPr>
               <w:t xml:space="preserve">        </w:t>
             </w:r>
             <w:proofErr w:type="gramStart"/>
@@ -7270,6 +7303,7 @@
                 <w:color w:val="000000" w:themeColor="text1"/>
                 <w:lang w:val="es-ES"/>
               </w:rPr>
+              <w:lastRenderedPageBreak/>
               <w:t xml:space="preserve"> </w:t>
             </w:r>
           </w:p>
@@ -7369,7 +7403,6 @@
                 <w:rFonts w:ascii="Aptos" w:eastAsia="Aptos" w:hAnsi="Aptos" w:cs="Aptos"/>
                 <w:color w:val="000000" w:themeColor="text1"/>
               </w:rPr>
-              <w:lastRenderedPageBreak/>
               <w:t xml:space="preserve">    }</w:t>
             </w:r>
           </w:p>
@@ -7944,6 +7977,7 @@
           <w:bCs/>
           <w:lang w:val="es-ES"/>
         </w:rPr>
+        <w:lastRenderedPageBreak/>
         <w:t>Ninguna capa intermedia captura excepciones.</w:t>
       </w:r>
       <w:r>
@@ -8025,7 +8059,6 @@
           <w:bCs/>
           <w:lang w:val="es-ES"/>
         </w:rPr>
-        <w:lastRenderedPageBreak/>
         <w:t>Un cambio de orden respecto al original.</w:t>
       </w:r>
       <w:r>
@@ -9036,7 +9069,14 @@
         <w:rPr>
           <w:lang w:val="es-ES"/>
         </w:rPr>
-        <w:t xml:space="preserve">. Este imprime una línea en blanco, la cabecera del manejador y, como la excepción es una </w:t>
+        <w:t xml:space="preserve">. Este imprime una línea en </w:t>
+      </w:r>
+      <w:r>
+        <w:rPr>
+          <w:lang w:val="es-ES"/>
+        </w:rPr>
+        <w:lastRenderedPageBreak/>
+        <w:t xml:space="preserve">blanco, la cabecera del manejador y, como la excepción es una </w:t>
       </w:r>
       <w:r>
         <w:rPr>
@@ -9126,7 +9166,6 @@
         <w:rPr>
           <w:lang w:val="es-ES"/>
         </w:rPr>
-        <w:lastRenderedPageBreak/>
         <w:t xml:space="preserve">Conviene fijarse en dos cosas: que </w:t>
       </w:r>
       <w:proofErr w:type="gramStart"/>
@@ -9895,6 +9934,7 @@
                 <w:sz w:val="20"/>
                 <w:szCs w:val="20"/>
               </w:rPr>
+              <w:lastRenderedPageBreak/>
               <w:t xml:space="preserve"> </w:t>
             </w:r>
             <w:r>
@@ -10236,7 +10276,6 @@
                 <w:szCs w:val="20"/>
                 <w:lang w:val="es-ES"/>
               </w:rPr>
-              <w:lastRenderedPageBreak/>
               <w:t xml:space="preserve"> Banco </w:t>
             </w:r>
             <w:r>
@@ -11379,6 +11418,9 @@
           <w:p>
             <w:pPr>
               <w:shd w:val="clear" w:color="auto" w:fill="FFFFFF" w:themeFill="background1"/>
+              <w:rPr>
+                <w:lang w:val="es-ES"/>
+              </w:rPr>
             </w:pPr>
             <w:r>
               <w:rPr>
@@ -11396,6 +11438,7 @@
                 <w:color w:val="000000" w:themeColor="text1"/>
                 <w:sz w:val="20"/>
                 <w:szCs w:val="20"/>
+                <w:lang w:val="es-ES"/>
               </w:rPr>
               <w:t xml:space="preserve">} </w:t>
             </w:r>
@@ -11403,13 +11446,17 @@
           <w:p>
             <w:pPr>
               <w:shd w:val="clear" w:color="auto" w:fill="FFFFFF" w:themeFill="background1"/>
-            </w:pPr>
-            <w:r>
-              <w:rPr>
-                <w:rFonts w:ascii="Consolas" w:eastAsia="Consolas" w:hAnsi="Consolas" w:cs="Consolas"/>
-                <w:color w:val="000000" w:themeColor="text1"/>
-                <w:sz w:val="20"/>
-                <w:szCs w:val="20"/>
+              <w:rPr>
+                <w:lang w:val="es-ES"/>
+              </w:rPr>
+            </w:pPr>
+            <w:r>
+              <w:rPr>
+                <w:rFonts w:ascii="Consolas" w:eastAsia="Consolas" w:hAnsi="Consolas" w:cs="Consolas"/>
+                <w:color w:val="000000" w:themeColor="text1"/>
+                <w:sz w:val="20"/>
+                <w:szCs w:val="20"/>
+                <w:lang w:val="es-ES"/>
               </w:rPr>
               <w:t xml:space="preserve"> </w:t>
             </w:r>
@@ -11417,16 +11464,21 @@
           <w:p>
             <w:pPr>
               <w:shd w:val="clear" w:color="auto" w:fill="FFFFFF" w:themeFill="background1"/>
-            </w:pPr>
-            <w:r>
-              <w:rPr>
-                <w:rFonts w:ascii="Consolas" w:eastAsia="Consolas" w:hAnsi="Consolas" w:cs="Consolas"/>
-                <w:color w:val="000000" w:themeColor="text1"/>
-                <w:sz w:val="20"/>
-                <w:szCs w:val="20"/>
+              <w:rPr>
+                <w:lang w:val="es-ES"/>
+              </w:rPr>
+            </w:pPr>
+            <w:r>
+              <w:rPr>
+                <w:rFonts w:ascii="Consolas" w:eastAsia="Consolas" w:hAnsi="Consolas" w:cs="Consolas"/>
+                <w:color w:val="000000" w:themeColor="text1"/>
+                <w:sz w:val="20"/>
+                <w:szCs w:val="20"/>
+                <w:lang w:val="es-ES"/>
               </w:rPr>
               <w:t xml:space="preserve"> </w:t>
             </w:r>
+            <w:proofErr w:type="spellStart"/>
             <w:r>
               <w:rPr>
                 <w:rFonts w:ascii="Consolas" w:eastAsia="Consolas" w:hAnsi="Consolas" w:cs="Consolas"/>
@@ -11435,18 +11487,22 @@
                 <w:color w:val="7F0055"/>
                 <w:sz w:val="20"/>
                 <w:szCs w:val="20"/>
+                <w:lang w:val="es-ES"/>
               </w:rPr>
               <w:t>public</w:t>
             </w:r>
-            <w:r>
-              <w:rPr>
-                <w:rFonts w:ascii="Consolas" w:eastAsia="Consolas" w:hAnsi="Consolas" w:cs="Consolas"/>
-                <w:color w:val="000000" w:themeColor="text1"/>
-                <w:sz w:val="20"/>
-                <w:szCs w:val="20"/>
+            <w:proofErr w:type="spellEnd"/>
+            <w:r>
+              <w:rPr>
+                <w:rFonts w:ascii="Consolas" w:eastAsia="Consolas" w:hAnsi="Consolas" w:cs="Consolas"/>
+                <w:color w:val="000000" w:themeColor="text1"/>
+                <w:sz w:val="20"/>
+                <w:szCs w:val="20"/>
+                <w:lang w:val="es-ES"/>
               </w:rPr>
               <w:t xml:space="preserve"> </w:t>
             </w:r>
+            <w:proofErr w:type="spellStart"/>
             <w:r>
               <w:rPr>
                 <w:rFonts w:ascii="Consolas" w:eastAsia="Consolas" w:hAnsi="Consolas" w:cs="Consolas"/>
@@ -11455,15 +11511,18 @@
                 <w:color w:val="7F0055"/>
                 <w:sz w:val="20"/>
                 <w:szCs w:val="20"/>
+                <w:lang w:val="es-ES"/>
               </w:rPr>
               <w:t>void</w:t>
             </w:r>
-            <w:r>
-              <w:rPr>
-                <w:rFonts w:ascii="Consolas" w:eastAsia="Consolas" w:hAnsi="Consolas" w:cs="Consolas"/>
-                <w:color w:val="000000" w:themeColor="text1"/>
-                <w:sz w:val="20"/>
-                <w:szCs w:val="20"/>
+            <w:proofErr w:type="spellEnd"/>
+            <w:r>
+              <w:rPr>
+                <w:rFonts w:ascii="Consolas" w:eastAsia="Consolas" w:hAnsi="Consolas" w:cs="Consolas"/>
+                <w:color w:val="000000" w:themeColor="text1"/>
+                <w:sz w:val="20"/>
+                <w:szCs w:val="20"/>
+                <w:lang w:val="es-ES"/>
               </w:rPr>
               <w:t xml:space="preserve"> </w:t>
             </w:r>
@@ -11474,9 +11533,11 @@
                 <w:color w:val="000000" w:themeColor="text1"/>
                 <w:sz w:val="20"/>
                 <w:szCs w:val="20"/>
+                <w:lang w:val="es-ES"/>
               </w:rPr>
               <w:t>retirar(</w:t>
             </w:r>
+            <w:proofErr w:type="spellStart"/>
             <w:proofErr w:type="gramEnd"/>
             <w:r>
               <w:rPr>
@@ -11486,15 +11547,18 @@
                 <w:color w:val="7F0055"/>
                 <w:sz w:val="20"/>
                 <w:szCs w:val="20"/>
+                <w:lang w:val="es-ES"/>
               </w:rPr>
               <w:t>double</w:t>
             </w:r>
-            <w:r>
-              <w:rPr>
-                <w:rFonts w:ascii="Consolas" w:eastAsia="Consolas" w:hAnsi="Consolas" w:cs="Consolas"/>
-                <w:color w:val="000000" w:themeColor="text1"/>
-                <w:sz w:val="20"/>
-                <w:szCs w:val="20"/>
+            <w:proofErr w:type="spellEnd"/>
+            <w:r>
+              <w:rPr>
+                <w:rFonts w:ascii="Consolas" w:eastAsia="Consolas" w:hAnsi="Consolas" w:cs="Consolas"/>
+                <w:color w:val="000000" w:themeColor="text1"/>
+                <w:sz w:val="20"/>
+                <w:szCs w:val="20"/>
+                <w:lang w:val="es-ES"/>
               </w:rPr>
               <w:t xml:space="preserve"> </w:t>
             </w:r>
@@ -11504,6 +11568,7 @@
                 <w:color w:val="6A3E3E"/>
                 <w:sz w:val="20"/>
                 <w:szCs w:val="20"/>
+                <w:lang w:val="es-ES"/>
               </w:rPr>
               <w:t>cantidad</w:t>
             </w:r>
@@ -11513,6 +11578,7 @@
                 <w:color w:val="000000" w:themeColor="text1"/>
                 <w:sz w:val="20"/>
                 <w:szCs w:val="20"/>
+                <w:lang w:val="es-ES"/>
               </w:rPr>
               <w:t xml:space="preserve">) { </w:t>
             </w:r>
@@ -11520,16 +11586,21 @@
           <w:p>
             <w:pPr>
               <w:shd w:val="clear" w:color="auto" w:fill="FFFFFF" w:themeFill="background1"/>
-            </w:pPr>
-            <w:r>
-              <w:rPr>
-                <w:rFonts w:ascii="Consolas" w:eastAsia="Consolas" w:hAnsi="Consolas" w:cs="Consolas"/>
-                <w:color w:val="000000" w:themeColor="text1"/>
-                <w:sz w:val="20"/>
-                <w:szCs w:val="20"/>
+              <w:rPr>
+                <w:lang w:val="es-ES"/>
+              </w:rPr>
+            </w:pPr>
+            <w:r>
+              <w:rPr>
+                <w:rFonts w:ascii="Consolas" w:eastAsia="Consolas" w:hAnsi="Consolas" w:cs="Consolas"/>
+                <w:color w:val="000000" w:themeColor="text1"/>
+                <w:sz w:val="20"/>
+                <w:szCs w:val="20"/>
+                <w:lang w:val="es-ES"/>
               </w:rPr>
               <w:t xml:space="preserve"> </w:t>
             </w:r>
+            <w:proofErr w:type="spellStart"/>
             <w:r>
               <w:rPr>
                 <w:rFonts w:ascii="Consolas" w:eastAsia="Consolas" w:hAnsi="Consolas" w:cs="Consolas"/>
@@ -11538,15 +11609,18 @@
                 <w:color w:val="7F0055"/>
                 <w:sz w:val="20"/>
                 <w:szCs w:val="20"/>
+                <w:lang w:val="es-ES"/>
               </w:rPr>
               <w:t>if</w:t>
             </w:r>
-            <w:r>
-              <w:rPr>
-                <w:rFonts w:ascii="Consolas" w:eastAsia="Consolas" w:hAnsi="Consolas" w:cs="Consolas"/>
-                <w:color w:val="000000" w:themeColor="text1"/>
-                <w:sz w:val="20"/>
-                <w:szCs w:val="20"/>
+            <w:proofErr w:type="spellEnd"/>
+            <w:r>
+              <w:rPr>
+                <w:rFonts w:ascii="Consolas" w:eastAsia="Consolas" w:hAnsi="Consolas" w:cs="Consolas"/>
+                <w:color w:val="000000" w:themeColor="text1"/>
+                <w:sz w:val="20"/>
+                <w:szCs w:val="20"/>
+                <w:lang w:val="es-ES"/>
               </w:rPr>
               <w:t xml:space="preserve"> (</w:t>
             </w:r>
@@ -11556,6 +11630,7 @@
                 <w:color w:val="6A3E3E"/>
                 <w:sz w:val="20"/>
                 <w:szCs w:val="20"/>
+                <w:lang w:val="es-ES"/>
               </w:rPr>
               <w:t>cantidad</w:t>
             </w:r>
@@ -11565,6 +11640,7 @@
                 <w:color w:val="000000" w:themeColor="text1"/>
                 <w:sz w:val="20"/>
                 <w:szCs w:val="20"/>
+                <w:lang w:val="es-ES"/>
               </w:rPr>
               <w:t xml:space="preserve"> &lt;= 0) { </w:t>
             </w:r>
@@ -11572,16 +11648,21 @@
           <w:p>
             <w:pPr>
               <w:shd w:val="clear" w:color="auto" w:fill="FFFFFF" w:themeFill="background1"/>
-            </w:pPr>
-            <w:r>
-              <w:rPr>
-                <w:rFonts w:ascii="Consolas" w:eastAsia="Consolas" w:hAnsi="Consolas" w:cs="Consolas"/>
-                <w:color w:val="000000" w:themeColor="text1"/>
-                <w:sz w:val="20"/>
-                <w:szCs w:val="20"/>
+              <w:rPr>
+                <w:lang w:val="es-ES"/>
+              </w:rPr>
+            </w:pPr>
+            <w:r>
+              <w:rPr>
+                <w:rFonts w:ascii="Consolas" w:eastAsia="Consolas" w:hAnsi="Consolas" w:cs="Consolas"/>
+                <w:color w:val="000000" w:themeColor="text1"/>
+                <w:sz w:val="20"/>
+                <w:szCs w:val="20"/>
+                <w:lang w:val="es-ES"/>
               </w:rPr>
               <w:t xml:space="preserve"> </w:t>
             </w:r>
+            <w:proofErr w:type="spellStart"/>
             <w:r>
               <w:rPr>
                 <w:rFonts w:ascii="Consolas" w:eastAsia="Consolas" w:hAnsi="Consolas" w:cs="Consolas"/>
@@ -11590,15 +11671,18 @@
                 <w:color w:val="7F0055"/>
                 <w:sz w:val="20"/>
                 <w:szCs w:val="20"/>
+                <w:lang w:val="es-ES"/>
               </w:rPr>
               <w:t>throw</w:t>
             </w:r>
-            <w:r>
-              <w:rPr>
-                <w:rFonts w:ascii="Consolas" w:eastAsia="Consolas" w:hAnsi="Consolas" w:cs="Consolas"/>
-                <w:color w:val="000000" w:themeColor="text1"/>
-                <w:sz w:val="20"/>
-                <w:szCs w:val="20"/>
+            <w:proofErr w:type="spellEnd"/>
+            <w:r>
+              <w:rPr>
+                <w:rFonts w:ascii="Consolas" w:eastAsia="Consolas" w:hAnsi="Consolas" w:cs="Consolas"/>
+                <w:color w:val="000000" w:themeColor="text1"/>
+                <w:sz w:val="20"/>
+                <w:szCs w:val="20"/>
+                <w:lang w:val="es-ES"/>
               </w:rPr>
               <w:t xml:space="preserve"> </w:t>
             </w:r>
@@ -11610,6 +11694,7 @@
                 <w:color w:val="7F0055"/>
                 <w:sz w:val="20"/>
                 <w:szCs w:val="20"/>
+                <w:lang w:val="es-ES"/>
               </w:rPr>
               <w:t>new</w:t>
             </w:r>
@@ -11619,9 +11704,11 @@
                 <w:color w:val="000000" w:themeColor="text1"/>
                 <w:sz w:val="20"/>
                 <w:szCs w:val="20"/>
+                <w:lang w:val="es-ES"/>
               </w:rPr>
               <w:t xml:space="preserve"> </w:t>
             </w:r>
+            <w:proofErr w:type="spellStart"/>
             <w:proofErr w:type="gramStart"/>
             <w:r>
               <w:rPr>
@@ -11629,8 +11716,20 @@
                 <w:color w:val="000000" w:themeColor="text1"/>
                 <w:sz w:val="20"/>
                 <w:szCs w:val="20"/>
-              </w:rPr>
-              <w:t>IllegalArgumentException(</w:t>
+                <w:lang w:val="es-ES"/>
+              </w:rPr>
+              <w:t>IllegalArgumentException</w:t>
+            </w:r>
+            <w:proofErr w:type="spellEnd"/>
+            <w:r>
+              <w:rPr>
+                <w:rFonts w:ascii="Consolas" w:eastAsia="Consolas" w:hAnsi="Consolas" w:cs="Consolas"/>
+                <w:color w:val="000000" w:themeColor="text1"/>
+                <w:sz w:val="20"/>
+                <w:szCs w:val="20"/>
+                <w:lang w:val="es-ES"/>
+              </w:rPr>
+              <w:t>(</w:t>
             </w:r>
             <w:proofErr w:type="gramEnd"/>
             <w:r>
@@ -11639,6 +11738,7 @@
                 <w:color w:val="000000" w:themeColor="text1"/>
                 <w:sz w:val="20"/>
                 <w:szCs w:val="20"/>
+                <w:lang w:val="es-ES"/>
               </w:rPr>
               <w:t xml:space="preserve"> </w:t>
             </w:r>
@@ -11656,6 +11756,7 @@
                 <w:color w:val="000000" w:themeColor="text1"/>
                 <w:sz w:val="20"/>
                 <w:szCs w:val="20"/>
+                <w:lang w:val="es-ES"/>
               </w:rPr>
               <w:t xml:space="preserve"> </w:t>
             </w:r>
@@ -11866,7 +11967,7 @@
             <w:pPr>
               <w:shd w:val="clear" w:color="auto" w:fill="FFFFFF" w:themeFill="background1"/>
               <w:rPr>
-                <w:lang w:val="es-ES"/>
+                <w:lang w:val="en-US"/>
               </w:rPr>
             </w:pPr>
             <w:r>
@@ -11884,17 +11985,39 @@
                 <w:color w:val="2A00FF"/>
                 <w:sz w:val="20"/>
                 <w:szCs w:val="20"/>
-                <w:lang w:val="es-ES"/>
-              </w:rPr>
-              <w:t>"Saldo insuficiente"</w:t>
-            </w:r>
-            <w:r>
-              <w:rPr>
-                <w:rFonts w:ascii="Consolas" w:eastAsia="Consolas" w:hAnsi="Consolas" w:cs="Consolas"/>
-                <w:color w:val="000000" w:themeColor="text1"/>
-                <w:sz w:val="20"/>
-                <w:szCs w:val="20"/>
-                <w:lang w:val="es-ES"/>
+                <w:lang w:val="en-US"/>
+              </w:rPr>
+              <w:t xml:space="preserve">"Saldo </w:t>
+            </w:r>
+            <w:proofErr w:type="spellStart"/>
+            <w:r>
+              <w:rPr>
+                <w:rFonts w:ascii="Consolas" w:eastAsia="Consolas" w:hAnsi="Consolas" w:cs="Consolas"/>
+                <w:color w:val="2A00FF"/>
+                <w:sz w:val="20"/>
+                <w:szCs w:val="20"/>
+                <w:lang w:val="en-US"/>
+              </w:rPr>
+              <w:t>insuficiente</w:t>
+            </w:r>
+            <w:proofErr w:type="spellEnd"/>
+            <w:r>
+              <w:rPr>
+                <w:rFonts w:ascii="Consolas" w:eastAsia="Consolas" w:hAnsi="Consolas" w:cs="Consolas"/>
+                <w:color w:val="2A00FF"/>
+                <w:sz w:val="20"/>
+                <w:szCs w:val="20"/>
+                <w:lang w:val="en-US"/>
+              </w:rPr>
+              <w:t>"</w:t>
+            </w:r>
+            <w:r>
+              <w:rPr>
+                <w:rFonts w:ascii="Consolas" w:eastAsia="Consolas" w:hAnsi="Consolas" w:cs="Consolas"/>
+                <w:color w:val="000000" w:themeColor="text1"/>
+                <w:sz w:val="20"/>
+                <w:szCs w:val="20"/>
+                <w:lang w:val="en-US"/>
               </w:rPr>
               <w:t xml:space="preserve">); </w:t>
             </w:r>
@@ -11912,9 +12035,19 @@
                 <w:color w:val="000000" w:themeColor="text1"/>
                 <w:sz w:val="20"/>
                 <w:szCs w:val="20"/>
-                <w:lang w:val="es-ES"/>
-              </w:rPr>
-              <w:t xml:space="preserve"> } </w:t>
+                <w:lang w:val="en-US"/>
+              </w:rPr>
+              <w:t xml:space="preserve"> </w:t>
+            </w:r>
+            <w:r>
+              <w:rPr>
+                <w:rFonts w:ascii="Consolas" w:eastAsia="Consolas" w:hAnsi="Consolas" w:cs="Consolas"/>
+                <w:color w:val="000000" w:themeColor="text1"/>
+                <w:sz w:val="20"/>
+                <w:szCs w:val="20"/>
+                <w:lang w:val="es-ES"/>
+              </w:rPr>
+              <w:t xml:space="preserve">} </w:t>
             </w:r>
           </w:p>
           <w:p>
@@ -12148,6 +12281,9 @@
           <w:p>
             <w:pPr>
               <w:shd w:val="clear" w:color="auto" w:fill="FFFFFF" w:themeFill="background1"/>
+              <w:rPr>
+                <w:lang w:val="es-ES"/>
+              </w:rPr>
             </w:pPr>
             <w:r>
               <w:rPr>
@@ -12159,6 +12295,7 @@
               </w:rPr>
               <w:t xml:space="preserve"> </w:t>
             </w:r>
+            <w:proofErr w:type="spellStart"/>
             <w:r>
               <w:rPr>
                 <w:rFonts w:ascii="Consolas" w:eastAsia="Consolas" w:hAnsi="Consolas" w:cs="Consolas"/>
@@ -12167,15 +12304,18 @@
                 <w:color w:val="7F0055"/>
                 <w:sz w:val="20"/>
                 <w:szCs w:val="20"/>
+                <w:lang w:val="es-ES"/>
               </w:rPr>
               <w:t>if</w:t>
             </w:r>
-            <w:r>
-              <w:rPr>
-                <w:rFonts w:ascii="Consolas" w:eastAsia="Consolas" w:hAnsi="Consolas" w:cs="Consolas"/>
-                <w:color w:val="000000" w:themeColor="text1"/>
-                <w:sz w:val="20"/>
-                <w:szCs w:val="20"/>
+            <w:proofErr w:type="spellEnd"/>
+            <w:r>
+              <w:rPr>
+                <w:rFonts w:ascii="Consolas" w:eastAsia="Consolas" w:hAnsi="Consolas" w:cs="Consolas"/>
+                <w:color w:val="000000" w:themeColor="text1"/>
+                <w:sz w:val="20"/>
+                <w:szCs w:val="20"/>
+                <w:lang w:val="es-ES"/>
               </w:rPr>
               <w:t xml:space="preserve"> (</w:t>
             </w:r>
@@ -12185,6 +12325,7 @@
                 <w:color w:val="6A3E3E"/>
                 <w:sz w:val="20"/>
                 <w:szCs w:val="20"/>
+                <w:lang w:val="es-ES"/>
               </w:rPr>
               <w:t>cantidad</w:t>
             </w:r>
@@ -12194,6 +12335,7 @@
                 <w:color w:val="000000" w:themeColor="text1"/>
                 <w:sz w:val="20"/>
                 <w:szCs w:val="20"/>
+                <w:lang w:val="es-ES"/>
               </w:rPr>
               <w:t xml:space="preserve"> &lt;= 0) { </w:t>
             </w:r>
@@ -12201,16 +12343,21 @@
           <w:p>
             <w:pPr>
               <w:shd w:val="clear" w:color="auto" w:fill="FFFFFF" w:themeFill="background1"/>
-            </w:pPr>
-            <w:r>
-              <w:rPr>
-                <w:rFonts w:ascii="Consolas" w:eastAsia="Consolas" w:hAnsi="Consolas" w:cs="Consolas"/>
-                <w:color w:val="000000" w:themeColor="text1"/>
-                <w:sz w:val="20"/>
-                <w:szCs w:val="20"/>
+              <w:rPr>
+                <w:lang w:val="es-ES"/>
+              </w:rPr>
+            </w:pPr>
+            <w:r>
+              <w:rPr>
+                <w:rFonts w:ascii="Consolas" w:eastAsia="Consolas" w:hAnsi="Consolas" w:cs="Consolas"/>
+                <w:color w:val="000000" w:themeColor="text1"/>
+                <w:sz w:val="20"/>
+                <w:szCs w:val="20"/>
+                <w:lang w:val="es-ES"/>
               </w:rPr>
               <w:t xml:space="preserve"> </w:t>
             </w:r>
+            <w:proofErr w:type="spellStart"/>
             <w:r>
               <w:rPr>
                 <w:rFonts w:ascii="Consolas" w:eastAsia="Consolas" w:hAnsi="Consolas" w:cs="Consolas"/>
@@ -12219,15 +12366,18 @@
                 <w:color w:val="7F0055"/>
                 <w:sz w:val="20"/>
                 <w:szCs w:val="20"/>
+                <w:lang w:val="es-ES"/>
               </w:rPr>
               <w:t>throw</w:t>
             </w:r>
-            <w:r>
-              <w:rPr>
-                <w:rFonts w:ascii="Consolas" w:eastAsia="Consolas" w:hAnsi="Consolas" w:cs="Consolas"/>
-                <w:color w:val="000000" w:themeColor="text1"/>
-                <w:sz w:val="20"/>
-                <w:szCs w:val="20"/>
+            <w:proofErr w:type="spellEnd"/>
+            <w:r>
+              <w:rPr>
+                <w:rFonts w:ascii="Consolas" w:eastAsia="Consolas" w:hAnsi="Consolas" w:cs="Consolas"/>
+                <w:color w:val="000000" w:themeColor="text1"/>
+                <w:sz w:val="20"/>
+                <w:szCs w:val="20"/>
+                <w:lang w:val="es-ES"/>
               </w:rPr>
               <w:t xml:space="preserve"> </w:t>
             </w:r>
@@ -12239,6 +12389,7 @@
                 <w:color w:val="7F0055"/>
                 <w:sz w:val="20"/>
                 <w:szCs w:val="20"/>
+                <w:lang w:val="es-ES"/>
               </w:rPr>
               <w:t>new</w:t>
             </w:r>
@@ -12248,9 +12399,11 @@
                 <w:color w:val="000000" w:themeColor="text1"/>
                 <w:sz w:val="20"/>
                 <w:szCs w:val="20"/>
+                <w:lang w:val="es-ES"/>
               </w:rPr>
               <w:t xml:space="preserve"> </w:t>
             </w:r>
+            <w:proofErr w:type="spellStart"/>
             <w:proofErr w:type="gramStart"/>
             <w:r>
               <w:rPr>
@@ -12258,8 +12411,20 @@
                 <w:color w:val="000000" w:themeColor="text1"/>
                 <w:sz w:val="20"/>
                 <w:szCs w:val="20"/>
-              </w:rPr>
-              <w:t>IllegalArgumentException(</w:t>
+                <w:lang w:val="es-ES"/>
+              </w:rPr>
+              <w:t>IllegalArgumentException</w:t>
+            </w:r>
+            <w:proofErr w:type="spellEnd"/>
+            <w:r>
+              <w:rPr>
+                <w:rFonts w:ascii="Consolas" w:eastAsia="Consolas" w:hAnsi="Consolas" w:cs="Consolas"/>
+                <w:color w:val="000000" w:themeColor="text1"/>
+                <w:sz w:val="20"/>
+                <w:szCs w:val="20"/>
+                <w:lang w:val="es-ES"/>
+              </w:rPr>
+              <w:t>(</w:t>
             </w:r>
             <w:proofErr w:type="gramEnd"/>
             <w:r>
@@ -12268,6 +12433,7 @@
                 <w:color w:val="000000" w:themeColor="text1"/>
                 <w:sz w:val="20"/>
                 <w:szCs w:val="20"/>
+                <w:lang w:val="es-ES"/>
               </w:rPr>
               <w:t xml:space="preserve"> </w:t>
             </w:r>
@@ -12285,6 +12451,7 @@
                 <w:color w:val="000000" w:themeColor="text1"/>
                 <w:sz w:val="20"/>
                 <w:szCs w:val="20"/>
+                <w:lang w:val="es-ES"/>
               </w:rPr>
               <w:t xml:space="preserve"> </w:t>
             </w:r>
@@ -12422,6 +12589,7 @@
                 <w:sz w:val="20"/>
                 <w:szCs w:val="20"/>
               </w:rPr>
+              <w:lastRenderedPageBreak/>
               <w:t xml:space="preserve"> </w:t>
             </w:r>
           </w:p>
@@ -12590,7 +12758,6 @@
                 <w:sz w:val="20"/>
                 <w:szCs w:val="20"/>
               </w:rPr>
-              <w:lastRenderedPageBreak/>
               <w:t xml:space="preserve"> </w:t>
             </w:r>
             <w:r>
@@ -13311,6 +13478,9 @@
           <w:p>
             <w:pPr>
               <w:shd w:val="clear" w:color="auto" w:fill="FFFFFF" w:themeFill="background1"/>
+              <w:rPr>
+                <w:lang w:val="es-ES"/>
+              </w:rPr>
             </w:pPr>
             <w:r>
               <w:rPr>
@@ -13328,6 +13498,7 @@
                 <w:color w:val="000000" w:themeColor="text1"/>
                 <w:sz w:val="20"/>
                 <w:szCs w:val="20"/>
+                <w:lang w:val="es-ES"/>
               </w:rPr>
               <w:t xml:space="preserve">} </w:t>
             </w:r>
@@ -13335,13 +13506,17 @@
           <w:p>
             <w:pPr>
               <w:shd w:val="clear" w:color="auto" w:fill="FFFFFF" w:themeFill="background1"/>
-            </w:pPr>
-            <w:r>
-              <w:rPr>
-                <w:rFonts w:ascii="Consolas" w:eastAsia="Consolas" w:hAnsi="Consolas" w:cs="Consolas"/>
-                <w:color w:val="000000" w:themeColor="text1"/>
-                <w:sz w:val="20"/>
-                <w:szCs w:val="20"/>
+              <w:rPr>
+                <w:lang w:val="es-ES"/>
+              </w:rPr>
+            </w:pPr>
+            <w:r>
+              <w:rPr>
+                <w:rFonts w:ascii="Consolas" w:eastAsia="Consolas" w:hAnsi="Consolas" w:cs="Consolas"/>
+                <w:color w:val="000000" w:themeColor="text1"/>
+                <w:sz w:val="20"/>
+                <w:szCs w:val="20"/>
+                <w:lang w:val="es-ES"/>
               </w:rPr>
               <w:t xml:space="preserve"> </w:t>
             </w:r>
@@ -13349,16 +13524,21 @@
           <w:p>
             <w:pPr>
               <w:shd w:val="clear" w:color="auto" w:fill="FFFFFF" w:themeFill="background1"/>
-            </w:pPr>
-            <w:r>
-              <w:rPr>
-                <w:rFonts w:ascii="Consolas" w:eastAsia="Consolas" w:hAnsi="Consolas" w:cs="Consolas"/>
-                <w:color w:val="000000" w:themeColor="text1"/>
-                <w:sz w:val="20"/>
-                <w:szCs w:val="20"/>
+              <w:rPr>
+                <w:lang w:val="es-ES"/>
+              </w:rPr>
+            </w:pPr>
+            <w:r>
+              <w:rPr>
+                <w:rFonts w:ascii="Consolas" w:eastAsia="Consolas" w:hAnsi="Consolas" w:cs="Consolas"/>
+                <w:color w:val="000000" w:themeColor="text1"/>
+                <w:sz w:val="20"/>
+                <w:szCs w:val="20"/>
+                <w:lang w:val="es-ES"/>
               </w:rPr>
               <w:t xml:space="preserve"> </w:t>
             </w:r>
+            <w:proofErr w:type="spellStart"/>
             <w:r>
               <w:rPr>
                 <w:rFonts w:ascii="Consolas" w:eastAsia="Consolas" w:hAnsi="Consolas" w:cs="Consolas"/>
@@ -13367,15 +13547,18 @@
                 <w:color w:val="7F0055"/>
                 <w:sz w:val="20"/>
                 <w:szCs w:val="20"/>
+                <w:lang w:val="es-ES"/>
               </w:rPr>
               <w:t>if</w:t>
             </w:r>
-            <w:r>
-              <w:rPr>
-                <w:rFonts w:ascii="Consolas" w:eastAsia="Consolas" w:hAnsi="Consolas" w:cs="Consolas"/>
-                <w:color w:val="000000" w:themeColor="text1"/>
-                <w:sz w:val="20"/>
-                <w:szCs w:val="20"/>
+            <w:proofErr w:type="spellEnd"/>
+            <w:r>
+              <w:rPr>
+                <w:rFonts w:ascii="Consolas" w:eastAsia="Consolas" w:hAnsi="Consolas" w:cs="Consolas"/>
+                <w:color w:val="000000" w:themeColor="text1"/>
+                <w:sz w:val="20"/>
+                <w:szCs w:val="20"/>
+                <w:lang w:val="es-ES"/>
               </w:rPr>
               <w:t xml:space="preserve"> (</w:t>
             </w:r>
@@ -13385,6 +13568,7 @@
                 <w:color w:val="6A3E3E"/>
                 <w:sz w:val="20"/>
                 <w:szCs w:val="20"/>
+                <w:lang w:val="es-ES"/>
               </w:rPr>
               <w:t>cantidad</w:t>
             </w:r>
@@ -13394,6 +13578,7 @@
                 <w:color w:val="000000" w:themeColor="text1"/>
                 <w:sz w:val="20"/>
                 <w:szCs w:val="20"/>
+                <w:lang w:val="es-ES"/>
               </w:rPr>
               <w:t xml:space="preserve"> &lt;= 0) { </w:t>
             </w:r>
@@ -13401,16 +13586,21 @@
           <w:p>
             <w:pPr>
               <w:shd w:val="clear" w:color="auto" w:fill="FFFFFF" w:themeFill="background1"/>
-            </w:pPr>
-            <w:r>
-              <w:rPr>
-                <w:rFonts w:ascii="Consolas" w:eastAsia="Consolas" w:hAnsi="Consolas" w:cs="Consolas"/>
-                <w:color w:val="000000" w:themeColor="text1"/>
-                <w:sz w:val="20"/>
-                <w:szCs w:val="20"/>
+              <w:rPr>
+                <w:lang w:val="es-ES"/>
+              </w:rPr>
+            </w:pPr>
+            <w:r>
+              <w:rPr>
+                <w:rFonts w:ascii="Consolas" w:eastAsia="Consolas" w:hAnsi="Consolas" w:cs="Consolas"/>
+                <w:color w:val="000000" w:themeColor="text1"/>
+                <w:sz w:val="20"/>
+                <w:szCs w:val="20"/>
+                <w:lang w:val="es-ES"/>
               </w:rPr>
               <w:t xml:space="preserve"> </w:t>
             </w:r>
+            <w:proofErr w:type="spellStart"/>
             <w:r>
               <w:rPr>
                 <w:rFonts w:ascii="Consolas" w:eastAsia="Consolas" w:hAnsi="Consolas" w:cs="Consolas"/>
@@ -13419,15 +13609,18 @@
                 <w:color w:val="7F0055"/>
                 <w:sz w:val="20"/>
                 <w:szCs w:val="20"/>
+                <w:lang w:val="es-ES"/>
               </w:rPr>
               <w:t>throw</w:t>
             </w:r>
-            <w:r>
-              <w:rPr>
-                <w:rFonts w:ascii="Consolas" w:eastAsia="Consolas" w:hAnsi="Consolas" w:cs="Consolas"/>
-                <w:color w:val="000000" w:themeColor="text1"/>
-                <w:sz w:val="20"/>
-                <w:szCs w:val="20"/>
+            <w:proofErr w:type="spellEnd"/>
+            <w:r>
+              <w:rPr>
+                <w:rFonts w:ascii="Consolas" w:eastAsia="Consolas" w:hAnsi="Consolas" w:cs="Consolas"/>
+                <w:color w:val="000000" w:themeColor="text1"/>
+                <w:sz w:val="20"/>
+                <w:szCs w:val="20"/>
+                <w:lang w:val="es-ES"/>
               </w:rPr>
               <w:t xml:space="preserve"> </w:t>
             </w:r>
@@ -13439,6 +13632,7 @@
                 <w:color w:val="7F0055"/>
                 <w:sz w:val="20"/>
                 <w:szCs w:val="20"/>
+                <w:lang w:val="es-ES"/>
               </w:rPr>
               <w:t>new</w:t>
             </w:r>
@@ -13448,9 +13642,11 @@
                 <w:color w:val="000000" w:themeColor="text1"/>
                 <w:sz w:val="20"/>
                 <w:szCs w:val="20"/>
+                <w:lang w:val="es-ES"/>
               </w:rPr>
               <w:t xml:space="preserve"> </w:t>
             </w:r>
+            <w:proofErr w:type="spellStart"/>
             <w:proofErr w:type="gramStart"/>
             <w:r>
               <w:rPr>
@@ -13458,8 +13654,20 @@
                 <w:color w:val="000000" w:themeColor="text1"/>
                 <w:sz w:val="20"/>
                 <w:szCs w:val="20"/>
-              </w:rPr>
-              <w:t>IllegalArgumentException(</w:t>
+                <w:lang w:val="es-ES"/>
+              </w:rPr>
+              <w:t>IllegalArgumentException</w:t>
+            </w:r>
+            <w:proofErr w:type="spellEnd"/>
+            <w:r>
+              <w:rPr>
+                <w:rFonts w:ascii="Consolas" w:eastAsia="Consolas" w:hAnsi="Consolas" w:cs="Consolas"/>
+                <w:color w:val="000000" w:themeColor="text1"/>
+                <w:sz w:val="20"/>
+                <w:szCs w:val="20"/>
+                <w:lang w:val="es-ES"/>
+              </w:rPr>
+              <w:t>(</w:t>
             </w:r>
             <w:proofErr w:type="gramEnd"/>
             <w:r>
@@ -13468,6 +13676,7 @@
                 <w:color w:val="000000" w:themeColor="text1"/>
                 <w:sz w:val="20"/>
                 <w:szCs w:val="20"/>
+                <w:lang w:val="es-ES"/>
               </w:rPr>
               <w:t xml:space="preserve"> </w:t>
             </w:r>
@@ -13485,6 +13694,7 @@
                 <w:color w:val="000000" w:themeColor="text1"/>
                 <w:sz w:val="20"/>
                 <w:szCs w:val="20"/>
+                <w:lang w:val="es-ES"/>
               </w:rPr>
               <w:t xml:space="preserve"> </w:t>
             </w:r>
@@ -14648,6 +14858,7 @@
                 <w:sz w:val="20"/>
                 <w:szCs w:val="20"/>
               </w:rPr>
+              <w:lastRenderedPageBreak/>
               <w:t xml:space="preserve">} </w:t>
             </w:r>
           </w:p>
@@ -14677,7 +14888,6 @@
         <w:rPr>
           <w:lang w:val="es-ES"/>
         </w:rPr>
-        <w:lastRenderedPageBreak/>
         <w:t xml:space="preserve">Soluciona los errores de compilación y aplica </w:t>
       </w:r>
       <w:proofErr w:type="gramStart"/>
@@ -15883,6 +16093,7 @@
         <w:rPr>
           <w:lang w:val="es-ES"/>
         </w:rPr>
+        <w:lastRenderedPageBreak/>
         <w:t>Respuesta: buenas prácticas aplicadas</w:t>
       </w:r>
     </w:p>
@@ -16011,7 +16222,6 @@
           <w:bCs/>
           <w:lang w:val="es-ES"/>
         </w:rPr>
-        <w:lastRenderedPageBreak/>
         <w:t>La excepción se trata donde se puede decidir qué hacer.</w:t>
       </w:r>
       <w:r>
@@ -16617,6 +16827,7 @@
           <w:bCs/>
           <w:lang w:val="es-ES"/>
         </w:rPr>
+        <w:lastRenderedPageBreak/>
         <w:t>Mensajes de excepción con datos.</w:t>
       </w:r>
       <w:r>
@@ -16811,7 +17022,6 @@
           <w:bCs/>
           <w:lang w:val="es-ES"/>
         </w:rPr>
-        <w:lastRenderedPageBreak/>
         <w:t>Nota.</w:t>
       </w:r>
       <w:r>
@@ -18628,6 +18838,17 @@
       <w:shd w:val="clear" w:color="auto" w:fill="E1DFDD"/>
     </w:rPr>
   </w:style>
+  <w:style w:type="character" w:styleId="Strong">
+    <w:name w:val="Strong"/>
+    <w:basedOn w:val="DefaultParagraphFont"/>
+    <w:uiPriority w:val="22"/>
+    <w:qFormat/>
+    <w:rsid w:val="00A253E9"/>
+    <w:rPr>
+      <w:b/>
+      <w:bCs/>
+    </w:rPr>
+  </w:style>
 </w:styles>
 </file>
 

</xml_diff>